<commit_message>
feat: add SQLite storage layer and wire digest through it per FR6/FR8
Minimal repository-pattern schema (classifications, digests) — just
enough for classification logging and digest generation; drafting
(Stage 4) extends this once it knows what it needs. digest command reads
ambiguous classifications back from the same store classify writes to,
no separate mechanism.

Also documents a risk found during verification: classifying the same
50-email batch twice (identical input) produced different confidence
scores and at least one flip across the ambiguous threshold. Noted in
BRD Section 12 so Stage 6 measurement design doesn't assume
run-to-run determinism.

Co-Authored-By: Claude Sonnet 5 <noreply@anthropic.com>
</commit_message>
<xml_diff>
--- a/docs/BRD.docx
+++ b/docs/BRD.docx
@@ -2235,6 +2235,34 @@
                 <w:szCs w:val="20"/>
               </w:rPr>
               <w:t xml:space="preserve">Deferred as a stretch goal given its complexity relative to MVP timeline</w:t>
+            </w:r>
+          </w:p>
+        </w:tc>
+      </w:tr>
+      <w:tr>
+        <w:tc>
+          <w:tcPr>
+            <w:tcW w:type="dxa" w:w="3000"/>
+          </w:tcPr>
+          <w:p>
+            <w:r>
+              <w:rPr>
+                <w:sz w:val="20"/>
+              </w:rPr>
+              <w:t>Classification non-determinism at the confidence threshold</w:t>
+            </w:r>
+          </w:p>
+        </w:tc>
+        <w:tc>
+          <w:tcPr>
+            <w:tcW w:type="dxa" w:w="6600"/>
+          </w:tcPr>
+          <w:p>
+            <w:r>
+              <w:rPr>
+                <w:sz w:val="20"/>
+              </w:rPr>
+              <w:t>Same 50-email batch classified twice with identical input produced different confidence scores and at least one flip across the ambiguous threshold (observed during Stage 3 verification); Stage 6 measurement design should not assume run-to-run determinism</w:t>
             </w:r>
           </w:p>
         </w:tc>

</xml_diff>

<commit_message>
docs: log scheduling-rubric re-verification result in BRD Section 12
Re-ran classify on the same 400-email sample after the scheduling
rubric fix: 0/400 false positives (down from 3/3), 0 scheduling emails
found at all in this sample (real ones just aren't present right now,
not masked by the fix). Confirmed the two known Stage 3 ambiguous
cases (security-alert, login-notification) still classify sensibly.
n=400, single re-run, same small-sample caveat as Section 9.

Co-Authored-By: Claude Sonnet 5 <noreply@anthropic.com>
</commit_message>
<xml_diff>
--- a/docs/BRD.docx
+++ b/docs/BRD.docx
@@ -2263,6 +2263,34 @@
                 <w:sz w:val="20"/>
               </w:rPr>
               <w:t>Tightened classification prompt (explicit scoring rubric) and switched confidence to discrete bands (high/medium/low) instead of a continuous 0-1 score, which reduced but did not eliminate the effect: baseline was 6/50 emails affected (1 threshold flip + 5 confidence drifts) on a 2-call identical-input trial; after the change, 0/50 on one 2-call trial and 2/50 (1 flip + 1 diff) on a stricter 3-call trial. All figures are n=50, single batch, not a large-scale validation -- same small-sample caveat as the Section 9 timing study. Stage 6 measurement design should still classify once and freeze results rather than assume run-to-run determinism.</w:t>
+            </w:r>
+          </w:p>
+        </w:tc>
+      </w:tr>
+      <w:tr>
+        <w:tc>
+          <w:tcPr>
+            <w:tcW w:type="dxa" w:w="3000"/>
+          </w:tcPr>
+          <w:p>
+            <w:r>
+              <w:rPr>
+                <w:sz w:val="20"/>
+              </w:rPr>
+              <w:t>Scheduling classification catching marketing RSVP invites</w:t>
+            </w:r>
+          </w:p>
+        </w:tc>
+        <w:tc>
+          <w:tcPr>
+            <w:tcW w:type="dxa" w:w="6600"/>
+          </w:tcPr>
+          <w:p>
+            <w:r>
+              <w:rPr>
+                <w:sz w:val="20"/>
+              </w:rPr>
+              <w:t>Found during stage 4 verification: every "scheduling" match across a 400-email sample (3/3) was a retail marketing event invite (Nordstrom "YOU'RE INVITED", RSVP NOW, DATE/TIME/LOCATION fields), not a person expecting a reply -- drafting "I'll RSVP now, see you then" to a store CRM blast is wrong output. Classify only sees subject/sender/snippet, not the full body, and the actual "advertising message from Nordstrom" footer sits past the ~100-char snippet cutoff -- confirmed the model never saw it. Rubric tightened to require a real individual expecting a reply, using signals actually visible in subject/sender/snippet (brand-like sender domain, ad-copy tone/structure, mass-invite framing) rather than assuming full-body access. Re-run on the same 400-email sample: 0/400 false positives (down from 3/3), and 0 scheduling emails found at all -- this inbox segment currently has none, real or false-positive. The two known Stage 3 ambiguous cases (security-alert and login-notification emails) still classified sensibly after the fix. n=400, single batch/single re-run, not a large-scale validation -- same small-sample caveat as Section 9.</w:t>
             </w:r>
           </w:p>
         </w:tc>

</xml_diff>

<commit_message>
docs: log real single-message scheduling verification in BRD Section 12
No genuine person-to-person scheduling email existed anywhere in the
account -- one was sent from a real external account (tfr5372@psu.edu)
to produce one authentic data point via the new --message-id path.
Classified correctly; draft picked one of the sender's two actually-
offered times and greeted them by their own signature name, both
grounded in the real body.

Noted explicitly: this unblocks stage 5, it does not claim every
scheduling variant is covered. Broader real-world coverage is expected
to accumulate during stage 6's dogfooding period rather than being
purpose-built now.

Co-Authored-By: Claude Sonnet 5 <noreply@anthropic.com>
</commit_message>
<xml_diff>
--- a/docs/BRD.docx
+++ b/docs/BRD.docx
@@ -2291,6 +2291,12 @@
                 <w:sz w:val="20"/>
               </w:rPr>
               <w:t>Found during stage 4 verification: every "scheduling" match across a 400-email sample (3/3) was a retail marketing event invite (Nordstrom "YOU'RE INVITED", RSVP NOW, DATE/TIME/LOCATION fields), not a person expecting a reply -- drafting "I'll RSVP now, see you then" to a store CRM blast is wrong output. Classify only sees subject/sender/snippet, not the full body, and the actual "advertising message from Nordstrom" footer sits past the ~100-char snippet cutoff -- confirmed the model never saw it. Rubric tightened to require a real individual expecting a reply, using signals actually visible in subject/sender/snippet (brand-like sender domain, ad-copy tone/structure, mass-invite framing) rather than assuming full-body access. Re-run on the same 400-email sample: 0/400 false positives (down from 3/3), and 0 scheduling emails found at all -- this inbox segment currently has none, real or false-positive. The two known Stage 3 ambiguous cases (security-alert and login-notification emails) still classified sensibly after the fix. n=400, single batch/single re-run, not a large-scale validation -- same small-sample caveat as Section 9.</w:t>
+            </w:r>
+            <w:r>
+              <w:rPr>
+                <w:sz w:val="20"/>
+              </w:rPr>
+              <w:t xml:space="preserve"> No genuine person-to-person scheduling email existed anywhere in the account (searched Sent, .ics attachments, calendar-invite subjects) to close the loop with real data -- only marketing RSVPs and already-booked Calendly confirmations. One genuine test email was sent from a real external account (tfr5372@psu.edu) to produce one authentic data point: classified correctly as scheduling, and the generated draft picked one of the sender's two actually-offered time options ("Wednesday afternoon or Thursday morning") and greeted them by the name in their own signature -- both grounded in the real body, not invented. This single end-to-end verification is enough to unblock stage 5; it is not a claim that every scheduling variant (group invites, reschedules, multi-party threads, etc.) has been tested. Broader real-world coverage is expected to accumulate naturally during stage 6's dogfooding period rather than being purpose-built here.</w:t>
             </w:r>
           </w:p>
         </w:tc>

</xml_diff>

<commit_message>
docs: update BRD Section 10 for the Streamlit -> FastAPI + custom UI swap
Splits the old combined "CLI" row (Typer/argparse (MVP), Streamlit
(polish phase)) into two: CLI stays Typer/argparse, and a new "UI
(stage 7 polish)" row documents the actual stack -- FastAPI backend +
a single custom HTML/CSS/JS frontend, replacing Streamlit. States the
reason directly: switched for direct control over visual design that
Streamlit's component model doesn't give. A real architecture decision
with a recorded rationale, not a silent stack swap.

Co-Authored-By: Claude Sonnet 5 <noreply@anthropic.com>
</commit_message>
<xml_diff>
--- a/docs/BRD.docx
+++ b/docs/BRD.docx
@@ -1596,13 +1596,37 @@
           <w:p>
             <w:r>
               <w:rPr>
-                <w:b w:val="false"/>
-                <w:bCs w:val="false"/>
-                <w:color w:val="000000"/>
-                <w:sz w:val="20"/>
-                <w:szCs w:val="20"/>
-              </w:rPr>
-              <w:t xml:space="preserve">Typer/argparse (MVP), Streamlit (polish phase)</w:t>
+                <w:sz w:val="20"/>
+              </w:rPr>
+              <w:t>Typer/argparse (MVP and ongoing manual verification)</w:t>
+            </w:r>
+          </w:p>
+        </w:tc>
+      </w:tr>
+      <w:tr>
+        <w:tc>
+          <w:tcPr>
+            <w:tcW w:type="dxa" w:w="3000"/>
+          </w:tcPr>
+          <w:p>
+            <w:r>
+              <w:rPr>
+                <w:sz w:val="20"/>
+              </w:rPr>
+              <w:t>UI (stage 7 polish)</w:t>
+            </w:r>
+          </w:p>
+        </w:tc>
+        <w:tc>
+          <w:tcPr>
+            <w:tcW w:type="dxa" w:w="6600"/>
+          </w:tcPr>
+          <w:p>
+            <w:r>
+              <w:rPr>
+                <w:sz w:val="20"/>
+              </w:rPr>
+              <w:t>FastAPI backend (src/api) + a single custom HTML/CSS/JS frontend (src/ui/index.html) -- replaces the originally planned Streamlit app. Switched deliberately for direct control over visual design (layout, spacing, color, custom icon treatment) that Streamlit's component model does not give; a real architecture decision, not a silent swap.</w:t>
             </w:r>
           </w:p>
         </w:tc>

</xml_diff>